<commit_message>
Updated files missing in the last commit. (v2.13).
</commit_message>
<xml_diff>
--- a/unreal/Plugins/MiVRy/Documentation/Documentation.docx
+++ b/unreal/Plugins/MiVRy/Documentation/Documentation.docx
@@ -101,7 +101,16 @@
           <w:sz w:val="32"/>
           <w:szCs w:val="32"/>
         </w:rPr>
-        <w:t>V2.12</w:t>
+        <w:t>V2.1</w:t>
+      </w:r>
+      <w:r>
+        <w:rPr>
+          <w:rFonts w:eastAsia="" w:cs="" w:ascii="Calibri Light" w:hAnsi="Calibri Light" w:asciiTheme="majorHAnsi" w:cstheme="majorBidi" w:eastAsiaTheme="majorEastAsia" w:hAnsiTheme="majorHAnsi"/>
+          <w:color w:themeColor="accent1" w:themeShade="bf" w:val="2F5496"/>
+          <w:sz w:val="32"/>
+          <w:szCs w:val="32"/>
+        </w:rPr>
+        <w:t>3</w:t>
       </w:r>
     </w:p>
     <w:p>
@@ -510,15 +519,7 @@
       </w:pPr>
       <w:r>
         <w:rPr/>
-        <w:t>Copyright (c) 202</w:t>
-      </w:r>
-      <w:r>
-        <w:rPr/>
-        <w:t>5</w:t>
-      </w:r>
-      <w:r>
-        <w:rPr/>
-        <w:t xml:space="preserve"> MARUI-PlugIn (inc.)</w:t>
+        <w:t>Copyright (c) 2025 MARUI-PlugIn (inc.)</w:t>
       </w:r>
     </w:p>
     <w:p>
@@ -645,28 +646,52 @@
       </w:pPr>
       <w:r>
         <w:rPr/>
-        <w:t>1: What is 3D Gesture Recognition</w:t>
-      </w:r>
-    </w:p>
-    <w:p>
-      <w:pPr>
-        <w:pStyle w:val="Normal"/>
-        <w:rPr/>
-      </w:pPr>
-      <w:r>
-        <w:rPr/>
-        <w:t>2: Quick Start Guide</w:t>
-      </w:r>
-    </w:p>
-    <w:p>
-      <w:pPr>
-        <w:pStyle w:val="Normal"/>
-        <w:rPr/>
-      </w:pPr>
-      <w:r>
-        <w:rPr/>
-        <w:t>3: Package Overview</w:t>
-      </w:r>
+        <w:t xml:space="preserve">1: </w:t>
+      </w:r>
+      <w:hyperlink w:anchor="_toc113">
+        <w:r>
+          <w:rPr>
+            <w:rStyle w:val="Hyperlink"/>
+          </w:rPr>
+          <w:t>What is 3D Gesture Recognition</w:t>
+        </w:r>
+      </w:hyperlink>
+    </w:p>
+    <w:p>
+      <w:pPr>
+        <w:pStyle w:val="Normal"/>
+        <w:rPr/>
+      </w:pPr>
+      <w:r>
+        <w:rPr/>
+        <w:t xml:space="preserve">2: </w:t>
+      </w:r>
+      <w:hyperlink w:anchor="_toc119">
+        <w:r>
+          <w:rPr>
+            <w:rStyle w:val="Hyperlink"/>
+          </w:rPr>
+          <w:t>Quick Start Guide</w:t>
+        </w:r>
+      </w:hyperlink>
+    </w:p>
+    <w:p>
+      <w:pPr>
+        <w:pStyle w:val="Normal"/>
+        <w:rPr/>
+      </w:pPr>
+      <w:r>
+        <w:rPr/>
+        <w:t xml:space="preserve">3: </w:t>
+      </w:r>
+      <w:hyperlink w:anchor="_toc139">
+        <w:r>
+          <w:rPr>
+            <w:rStyle w:val="Hyperlink"/>
+          </w:rPr>
+          <w:t>Package Overview</w:t>
+        </w:r>
+      </w:hyperlink>
     </w:p>
     <w:p>
       <w:pPr>
@@ -677,7 +702,7 @@
         <w:rPr/>
         <w:t xml:space="preserve">4: </w:t>
       </w:r>
-      <w:hyperlink w:anchor="_4%25253A_License_and">
+      <w:hyperlink w:anchor="_4%25252525253A_License_and">
         <w:r>
           <w:rPr>
             <w:rStyle w:val="Hyperlink"/>
@@ -693,78 +718,160 @@
       </w:pPr>
       <w:r>
         <w:rPr/>
-        <w:t>5: How to use the GestureManager</w:t>
-      </w:r>
-    </w:p>
-    <w:p>
-      <w:pPr>
-        <w:pStyle w:val="Normal"/>
-        <w:rPr/>
-      </w:pPr>
-      <w:r>
-        <w:rPr/>
-        <w:t>6: How to use the MiVRyActor</w:t>
-      </w:r>
-    </w:p>
-    <w:p>
-      <w:pPr>
-        <w:pStyle w:val="Normal"/>
-        <w:rPr/>
-      </w:pPr>
-      <w:r>
-        <w:rPr/>
-        <w:t>7: How to use the GestureRecognitionActor (for one-handed gestures)</w:t>
-      </w:r>
-    </w:p>
-    <w:p>
-      <w:pPr>
-        <w:pStyle w:val="Normal"/>
-        <w:rPr/>
-      </w:pPr>
-      <w:r>
-        <w:rPr/>
-        <w:t>8: How to use the GestureCombinationsActor (for two-handed gestures or gesture combos)</w:t>
-      </w:r>
-    </w:p>
-    <w:p>
-      <w:pPr>
-        <w:pStyle w:val="Normal"/>
-        <w:rPr/>
-      </w:pPr>
-      <w:r>
-        <w:rPr/>
-        <w:t>9: How to use the MiVRy Composite and Decorator in UE Behavior Trees</w:t>
-      </w:r>
-    </w:p>
-    <w:p>
-      <w:pPr>
-        <w:pStyle w:val="Normal"/>
-        <w:rPr/>
-      </w:pPr>
-      <w:r>
-        <w:rPr/>
-        <w:t xml:space="preserve">10: Troubleshooting and Frequently Asked Questions (FAQ) </w:t>
-      </w:r>
-    </w:p>
-    <w:p>
-      <w:pPr>
-        <w:pStyle w:val="Normal"/>
-        <w:rPr/>
-      </w:pPr>
-      <w:r>
-        <w:rPr/>
-        <w:t>11: Build / Packaging Instructions</w:t>
-      </w:r>
-    </w:p>
-    <w:p>
-      <w:pPr>
-        <w:pStyle w:val="Normal"/>
-        <w:rPr/>
-      </w:pPr>
-      <w:r>
-        <w:rPr/>
-        <w:t>12: Software license statement (EULA)</w:t>
-      </w:r>
+        <w:t xml:space="preserve">5: </w:t>
+      </w:r>
+      <w:hyperlink w:anchor="_toc158">
+        <w:r>
+          <w:rPr>
+            <w:rStyle w:val="Hyperlink"/>
+          </w:rPr>
+          <w:t>How to use the GestureManager</w:t>
+        </w:r>
+      </w:hyperlink>
+    </w:p>
+    <w:p>
+      <w:pPr>
+        <w:pStyle w:val="Normal"/>
+        <w:rPr/>
+      </w:pPr>
+      <w:r>
+        <w:rPr/>
+        <w:t xml:space="preserve">6: </w:t>
+      </w:r>
+      <w:hyperlink w:anchor="_toc170">
+        <w:r>
+          <w:rPr>
+            <w:rStyle w:val="Hyperlink"/>
+          </w:rPr>
+          <w:t>How to use the MiVRyActor</w:t>
+        </w:r>
+      </w:hyperlink>
+    </w:p>
+    <w:p>
+      <w:pPr>
+        <w:pStyle w:val="Normal"/>
+        <w:rPr/>
+      </w:pPr>
+      <w:r>
+        <w:rPr/>
+        <w:t xml:space="preserve">7: </w:t>
+      </w:r>
+      <w:hyperlink w:anchor="_toc181">
+        <w:r>
+          <w:rPr>
+            <w:rStyle w:val="Hyperlink"/>
+          </w:rPr>
+          <w:t>How to use the GestureRecognitionActor (for one-handed gestures)</w:t>
+        </w:r>
+      </w:hyperlink>
+    </w:p>
+    <w:p>
+      <w:pPr>
+        <w:pStyle w:val="Normal"/>
+        <w:rPr/>
+      </w:pPr>
+      <w:r>
+        <w:rPr/>
+        <w:t xml:space="preserve">8: </w:t>
+      </w:r>
+      <w:hyperlink w:anchor="_toc198">
+        <w:r>
+          <w:rPr>
+            <w:rStyle w:val="Hyperlink"/>
+          </w:rPr>
+          <w:t>How to use the GestureCombinationsActor (for two-handed gestures or gesture combos)</w:t>
+        </w:r>
+      </w:hyperlink>
+    </w:p>
+    <w:p>
+      <w:pPr>
+        <w:pStyle w:val="Normal"/>
+        <w:rPr/>
+      </w:pPr>
+      <w:r>
+        <w:rPr/>
+        <w:t xml:space="preserve">9: </w:t>
+      </w:r>
+      <w:hyperlink w:anchor="_toc217">
+        <w:r>
+          <w:rPr>
+            <w:rStyle w:val="Hyperlink"/>
+          </w:rPr>
+          <w:t>How to use the MiVRy Composite and Decorator in UE Behavior Trees</w:t>
+        </w:r>
+      </w:hyperlink>
+    </w:p>
+    <w:p>
+      <w:pPr>
+        <w:pStyle w:val="Normal"/>
+        <w:rPr/>
+      </w:pPr>
+      <w:r>
+        <w:rPr/>
+        <w:t xml:space="preserve">10: </w:t>
+      </w:r>
+      <w:hyperlink w:anchor="_toc228">
+        <w:r>
+          <w:rPr>
+            <w:rStyle w:val="Hyperlink"/>
+          </w:rPr>
+          <w:t>Special applications</w:t>
+        </w:r>
+      </w:hyperlink>
+    </w:p>
+    <w:p>
+      <w:pPr>
+        <w:pStyle w:val="Normal"/>
+        <w:rPr/>
+      </w:pPr>
+      <w:r>
+        <w:rPr/>
+        <w:t xml:space="preserve">11: </w:t>
+      </w:r>
+      <w:hyperlink w:anchor="_toc245">
+        <w:r>
+          <w:rPr>
+            <w:rStyle w:val="Hyperlink"/>
+          </w:rPr>
+          <w:t xml:space="preserve">Troubleshooting and Frequently Asked Questions (FAQ) </w:t>
+        </w:r>
+      </w:hyperlink>
+    </w:p>
+    <w:p>
+      <w:pPr>
+        <w:pStyle w:val="Normal"/>
+        <w:rPr/>
+      </w:pPr>
+      <w:r>
+        <w:rPr/>
+        <w:t xml:space="preserve">12: </w:t>
+      </w:r>
+      <w:hyperlink w:anchor="_toc327">
+        <w:r>
+          <w:rPr>
+            <w:rStyle w:val="Hyperlink"/>
+          </w:rPr>
+          <w:t>Build / Packaging Instructions</w:t>
+        </w:r>
+      </w:hyperlink>
+    </w:p>
+    <w:p>
+      <w:pPr>
+        <w:pStyle w:val="Normal"/>
+        <w:rPr/>
+      </w:pPr>
+      <w:r>
+        <w:rPr/>
+        <w:t xml:space="preserve">13: </w:t>
+      </w:r>
+      <w:hyperlink w:anchor="_toc330">
+        <w:r>
+          <w:rPr>
+            <w:rStyle w:val="Hyperlink"/>
+          </w:rPr>
+          <w:t>Software license statement (EULA)</w:t>
+        </w:r>
+      </w:hyperlink>
     </w:p>
     <w:p>
       <w:pPr>
@@ -784,6 +891,8 @@
         <w:spacing w:before="0" w:after="0"/>
         <w:rPr/>
       </w:pPr>
+      <w:bookmarkStart w:id="2" w:name="_toc113"/>
+      <w:bookmarkEnd w:id="2"/>
       <w:r>
         <w:rPr/>
         <w:t>1: What is 3D Gesture Recognition?</w:t>
@@ -886,6 +995,8 @@
         <w:spacing w:before="0" w:after="0"/>
         <w:rPr/>
       </w:pPr>
+      <w:bookmarkStart w:id="3" w:name="_toc119"/>
+      <w:bookmarkEnd w:id="3"/>
       <w:r>
         <w:rPr/>
         <w:t>2: Quick Start Guide:</w:t>
@@ -1459,6 +1570,8 @@
         <w:spacing w:before="0" w:after="0"/>
         <w:rPr/>
       </w:pPr>
+      <w:bookmarkStart w:id="4" w:name="_toc139"/>
+      <w:bookmarkEnd w:id="4"/>
       <w:r>
         <w:rPr/>
         <w:t>3: Package Overview:</w:t>
@@ -1647,8 +1760,8 @@
         <w:spacing w:before="0" w:after="0"/>
         <w:rPr/>
       </w:pPr>
-      <w:bookmarkStart w:id="2" w:name="_4%25253A_License_and"/>
-      <w:bookmarkEnd w:id="2"/>
+      <w:bookmarkStart w:id="5" w:name="_4%25252525253A_License_and"/>
+      <w:bookmarkEnd w:id="5"/>
       <w:r>
         <w:rPr/>
         <w:t>4: License and Activation</w:t>
@@ -1813,6 +1926,8 @@
         <w:spacing w:before="0" w:after="0"/>
         <w:rPr/>
       </w:pPr>
+      <w:bookmarkStart w:id="6" w:name="_toc158"/>
+      <w:bookmarkEnd w:id="6"/>
       <w:r>
         <w:rPr/>
         <w:t>5: How to use the GestureManager</w:t>
@@ -1962,6 +2077,62 @@
     <w:p>
       <w:pPr>
         <w:pStyle w:val="Normal"/>
+        <w:rPr/>
+      </w:pPr>
+      <w:r>
+        <w:rPr>
+          <w:i/>
+          <w:iCs/>
+        </w:rPr>
+        <w:t>Compensate head motion during gesture</w:t>
+      </w:r>
+      <w:r>
+        <w:rPr/>
+        <w:t>: Whether the motion of your frame of reference should be removed from the motion of the joints of the hands. For example, if you’re turning you head to the right while constantly holding your hand in front of your face, the head rotation will be compensated and your hand will appear motionless to the gesture recognition AI. This setting affects how gestures are recorded – it is not possible to change this after the gesture sample has been recorded. Please note that activating the "compensate head motion" option is likely to result in lower recognition scores and lower similarity values for identified gestures. This is because people tend to look at their hands when gesturing. Imagine making a "swipe-left" gesture and a "swipe-right" gesture. If you don't compensate head motion, they are easy to distinguish. But if you look at your hands while making the gesture and compensate for that head motion, then all that MiVRy gets is that your hand stays in front of your face. Then it's difficult to distinguish whether you swiped left or right.</w:t>
+      </w:r>
+    </w:p>
+    <w:p>
+      <w:pPr>
+        <w:pStyle w:val="Normal"/>
+        <w:rPr/>
+      </w:pPr>
+      <w:r>
+        <w:rPr>
+          <w:i/>
+          <w:iCs/>
+        </w:rPr>
+        <w:t>Coordinate System Conversion</w:t>
+      </w:r>
+      <w:r>
+        <w:rPr/>
+        <w:t>: These two settings help to ensure that the same VR coordinates (the directions of “x”, “y”, and “z” of the headset and controllers) are used by the Gesture Manager and your final project. Set “</w:t>
+      </w:r>
+      <w:r>
+        <w:rPr>
+          <w:i/>
+          <w:iCs/>
+        </w:rPr>
+        <w:t>Unity XR Plug-in</w:t>
+      </w:r>
+      <w:r>
+        <w:rPr/>
+        <w:t>” to the XR plug-in that you are using in Unity (in Unity Project Settings -&gt; XR Plug-in Management). Set “</w:t>
+      </w:r>
+      <w:r>
+        <w:rPr>
+          <w:i/>
+          <w:iCs/>
+        </w:rPr>
+        <w:t>MiVRy Coordinate System</w:t>
+      </w:r>
+      <w:r>
+        <w:rPr/>
+        <w:t>” to whichever coordinate system you want to use in your own project (for example: “Unreal” for Unreal Engine coordinates). If you don’t wish to use different coordinate systems, you don’t need to adjust these values.</w:t>
+      </w:r>
+    </w:p>
+    <w:p>
+      <w:pPr>
+        <w:pStyle w:val="Normal"/>
         <w:rPr>
           <w:rFonts w:ascii="Calibri Light" w:hAnsi="Calibri Light" w:eastAsia="" w:cs="" w:asciiTheme="majorHAnsi" w:cstheme="majorBidi" w:eastAsiaTheme="majorEastAsia" w:hAnsiTheme="majorHAnsi"/>
           <w:color w:themeColor="accent1" w:themeShade="bf" w:val="2F5496"/>
@@ -1990,6 +2161,8 @@
         <w:spacing w:before="0" w:after="0"/>
         <w:rPr/>
       </w:pPr>
+      <w:bookmarkStart w:id="7" w:name="_toc170"/>
+      <w:bookmarkEnd w:id="7"/>
       <w:r>
         <w:rPr/>
         <w:t>6: How to use the MiVRyActor gesture recognition object</w:t>
@@ -2114,6 +2287,8 @@
         <w:spacing w:before="0" w:after="0"/>
         <w:rPr/>
       </w:pPr>
+      <w:bookmarkStart w:id="8" w:name="_toc181"/>
+      <w:bookmarkEnd w:id="8"/>
       <w:r>
         <w:rPr/>
         <w:t>7: How to use the GestureRecognitionActor (for one-handed gestures):</w:t>
@@ -2505,6 +2680,8 @@
         <w:spacing w:before="0" w:after="0"/>
         <w:rPr/>
       </w:pPr>
+      <w:bookmarkStart w:id="9" w:name="_toc198"/>
+      <w:bookmarkEnd w:id="9"/>
       <w:r>
         <w:rPr/>
         <w:t>8: How to use the GestureCombinationsActor (for two-handed gestures or gesture combos):</w:t>
@@ -2914,6 +3091,8 @@
         <w:pStyle w:val="Heading2"/>
         <w:rPr/>
       </w:pPr>
+      <w:bookmarkStart w:id="10" w:name="_toc217"/>
+      <w:bookmarkEnd w:id="10"/>
       <w:r>
         <w:rPr/>
         <w:t>9 How to use the MiVRy Composite and Decorator in UE Behavior Trees</w:t>
@@ -3094,15 +3273,222 @@
       <w:r>
         <w:rPr/>
       </w:r>
+      <w:r>
+        <w:br w:type="page"/>
+      </w:r>
     </w:p>
     <w:p>
       <w:pPr>
         <w:pStyle w:val="Heading2"/>
-        <w:rPr/>
-      </w:pPr>
-      <w:r>
-        <w:rPr/>
-        <w:t>10 Troubleshooting and Frequently Asked Questions (FAQ):</w:t>
+        <w:spacing w:before="0" w:after="0"/>
+        <w:rPr/>
+      </w:pPr>
+      <w:bookmarkStart w:id="11" w:name="_toc228"/>
+      <w:bookmarkEnd w:id="11"/>
+      <w:r>
+        <w:rPr/>
+        <w:t>10. Special Applications</w:t>
+      </w:r>
+    </w:p>
+    <w:p>
+      <w:pPr>
+        <w:pStyle w:val="Normal"/>
+        <w:spacing w:before="0" w:after="0"/>
+        <w:rPr/>
+      </w:pPr>
+      <w:r>
+        <w:rPr/>
+      </w:r>
+    </w:p>
+    <w:p>
+      <w:pPr>
+        <w:pStyle w:val="Normal"/>
+        <w:spacing w:before="0" w:after="0"/>
+        <w:rPr>
+          <w:b/>
+          <w:bCs/>
+        </w:rPr>
+      </w:pPr>
+      <w:r>
+        <w:rPr>
+          <w:b/>
+          <w:bCs/>
+        </w:rPr>
+        <w:t>(1) Identifying gestures while walking in the real world:</w:t>
+      </w:r>
+    </w:p>
+    <w:p>
+      <w:pPr>
+        <w:pStyle w:val="Normal"/>
+        <w:spacing w:before="0" w:after="0"/>
+        <w:rPr/>
+      </w:pPr>
+      <w:r>
+        <w:rPr/>
+        <w:t>If you want to identify a gesture while changing your position or orientation in the real world, it can help to activate the "Compensate Head Motion" option of MiVRy.</w:t>
+      </w:r>
+    </w:p>
+    <w:p>
+      <w:pPr>
+        <w:pStyle w:val="Normal"/>
+        <w:spacing w:before="0" w:after="0"/>
+        <w:rPr/>
+      </w:pPr>
+      <w:r>
+        <w:rPr/>
+        <w:t>This will cause MiVRy to record the controller position relative to the current headset position and rotation.</w:t>
+      </w:r>
+    </w:p>
+    <w:p>
+      <w:pPr>
+        <w:pStyle w:val="Normal"/>
+        <w:spacing w:before="0" w:after="0"/>
+        <w:rPr/>
+      </w:pPr>
+      <w:r>
+        <w:rPr/>
+        <w:t>In the Gesture Manager this can be activates in the Menu below the Recording Submenu under "Compensate Head Motion".</w:t>
+      </w:r>
+    </w:p>
+    <w:p>
+      <w:pPr>
+        <w:pStyle w:val="Normal"/>
+        <w:spacing w:before="0" w:after="0"/>
+        <w:rPr/>
+      </w:pPr>
+      <w:r>
+        <w:rPr/>
+        <w:t>In the MivryActor component offers the setting "CompensateHeadMotion".</w:t>
+      </w:r>
+    </w:p>
+    <w:p>
+      <w:pPr>
+        <w:pStyle w:val="Normal"/>
+        <w:spacing w:before="0" w:after="0"/>
+        <w:rPr/>
+      </w:pPr>
+      <w:r>
+        <w:rPr/>
+        <w:t>Please note that activating the "compensate head motion" option is likely to result in lower recognition scores and lower similarity values for identified gestures. This is because people tend to look at their hands when gesturing. Imagine making a "swipe-left" gesture and a "swipe-right" gesture. If you don't compensate head motion, they are easy to distinguish. But if you look at your hands while making the gesture and compensate for that head motion, then all that MiVRy gets is that your hand stays in front of your face. Then it's difficult to distinguish whether you swiped left or right.</w:t>
+      </w:r>
+    </w:p>
+    <w:p>
+      <w:pPr>
+        <w:pStyle w:val="Normal"/>
+        <w:spacing w:before="0" w:after="0"/>
+        <w:rPr/>
+      </w:pPr>
+      <w:r>
+        <w:rPr/>
+      </w:r>
+    </w:p>
+    <w:p>
+      <w:pPr>
+        <w:pStyle w:val="Normal"/>
+        <w:spacing w:before="0" w:after="0"/>
+        <w:rPr>
+          <w:b/>
+          <w:bCs/>
+        </w:rPr>
+      </w:pPr>
+      <w:r>
+        <w:rPr>
+          <w:b/>
+          <w:bCs/>
+        </w:rPr>
+        <w:t>(2) Continuous gesture identification</w:t>
+      </w:r>
+    </w:p>
+    <w:p>
+      <w:pPr>
+        <w:pStyle w:val="Normal"/>
+        <w:spacing w:before="0" w:after="0"/>
+        <w:rPr/>
+      </w:pPr>
+      <w:r>
+        <w:rPr/>
+      </w:r>
+    </w:p>
+    <w:p>
+      <w:pPr>
+        <w:pStyle w:val="Normal"/>
+        <w:spacing w:before="0" w:after="0"/>
+        <w:rPr/>
+      </w:pPr>
+      <w:r>
+        <w:rPr/>
+        <w:t>If you don't want to explicity define the beginning and end of a gesture motion (e.g. with a trigger button), you can use MiVRy to continously try to identify ongoing gesture motions while they are in the process.</w:t>
+      </w:r>
+    </w:p>
+    <w:p>
+      <w:pPr>
+        <w:pStyle w:val="Normal"/>
+        <w:spacing w:before="0" w:after="0"/>
+        <w:rPr/>
+      </w:pPr>
+      <w:r>
+        <w:rPr/>
+        <w:t>In the `MiVRyActor` component, this can be activated with the `ContinuousGestureRecognition` option.</w:t>
+      </w:r>
+    </w:p>
+    <w:p>
+      <w:pPr>
+        <w:pStyle w:val="Normal"/>
+        <w:spacing w:before="0" w:after="0"/>
+        <w:rPr/>
+      </w:pPr>
+      <w:r>
+        <w:rPr/>
+        <w:t>Please note that you still need to define a trigger to start/stop the overall identification process. Between the start and stop indicated by the trigger, MiVRy will continously try to identify the gesture motion. However, can set the trigger to an absolute value higher than the threshold instead of using some user input - then MiVRy will start immediately when the level is started.</w:t>
+      </w:r>
+    </w:p>
+    <w:p>
+      <w:pPr>
+        <w:pStyle w:val="Normal"/>
+        <w:spacing w:before="0" w:after="0"/>
+        <w:rPr/>
+      </w:pPr>
+      <w:r>
+        <w:rPr/>
+        <w:t>To do this with the `GestureRecognition` or `GestureCombinations` objects directly, you still have to call “startStroke” once (for example at the start of the level), and then you still have to continuously provide the controller position with the “contdStroke” function.</w:t>
+      </w:r>
+    </w:p>
+    <w:p>
+      <w:pPr>
+        <w:pStyle w:val="Normal"/>
+        <w:spacing w:before="0" w:after="0"/>
+        <w:rPr/>
+      </w:pPr>
+      <w:r>
+        <w:rPr/>
+        <w:t>After each call to the “contdStroke” function, you can use the “contdIdentify” function to identify the currently performed gesture. Use the contdIdentificationPeriod value to control how long of a time frame to consider in the identification. You can also use contdIdentificationSmoothing to avoid the identification result from jumping from one gesture ID to another too easily. For recording continuous gestures, you can use the "contdRecord" function, which should also be called after each call to "contdStroke" during recording. You don't need to call "endStroke" until you're finishing your gesture recording or identification session.</w:t>
+      </w:r>
+    </w:p>
+    <w:p>
+      <w:pPr>
+        <w:pStyle w:val="Normal"/>
+        <w:spacing w:before="0" w:after="0"/>
+        <w:rPr/>
+      </w:pPr>
+      <w:r>
+        <w:rPr/>
+        <w:t>Check the settings for `ContinuousGesturePeriod` and `ContinuousGestureSmoothing` to specify details regarding the continuous gesture identification.</w:t>
+      </w:r>
+      <w:r>
+        <w:br w:type="page"/>
+      </w:r>
+    </w:p>
+    <w:p>
+      <w:pPr>
+        <w:pStyle w:val="Heading2"/>
+        <w:spacing w:before="0" w:after="0"/>
+        <w:rPr/>
+      </w:pPr>
+      <w:bookmarkStart w:id="12" w:name="_toc245"/>
+      <w:bookmarkEnd w:id="12"/>
+      <w:r>
+        <w:rPr/>
+        <w:t>11 Troubleshooting and Frequently Asked Questions (FAQ):</w:t>
         <w:br/>
       </w:r>
     </w:p>
@@ -4297,9 +4683,11 @@
         <w:spacing w:before="0" w:after="0"/>
         <w:rPr/>
       </w:pPr>
-      <w:r>
-        <w:rPr/>
-        <w:t>11 Build / Packaging Instructions</w:t>
+      <w:bookmarkStart w:id="13" w:name="_toc327"/>
+      <w:bookmarkEnd w:id="13"/>
+      <w:r>
+        <w:rPr/>
+        <w:t>12 Build / Packaging Instructions</w:t>
       </w:r>
     </w:p>
     <w:p>
@@ -4463,9 +4851,11 @@
         <w:pStyle w:val="Heading2"/>
         <w:rPr/>
       </w:pPr>
-      <w:r>
-        <w:rPr/>
-        <w:t>12 Software license statement (EULA):</w:t>
+      <w:bookmarkStart w:id="14" w:name="_toc330"/>
+      <w:bookmarkEnd w:id="14"/>
+      <w:r>
+        <w:rPr/>
+        <w:t>13 Software license statement (EULA):</w:t>
       </w:r>
     </w:p>
     <w:p>

</xml_diff>